<commit_message>
improve text description of candidate 0.4 categories
</commit_message>
<xml_diff>
--- a/preregistration/package/06_redcap/participant_materials/Project_Owner_Review_Questionnaire_v3.docx
+++ b/preregistration/package/06_redcap/participant_materials/Project_Owner_Review_Questionnaire_v3.docx
@@ -823,6 +823,124 @@
           <w:color w:val="000000"/>
           <w:rtl w:val="0"/>
         </w:rPr>
+        <w:t xml:space="preserve">How the classifications work</w:t>
+      </w:r>
+      <w:r>
+        <w:rPr>
+          <w:rtl w:val="0"/>
+        </w:rPr>
+      </w:r>
+    </w:p>
+    <w:p>
+      <w:pPr>
+        <w:rPr/>
+      </w:pPr>
+      <w:r>
+        <w:rPr>
+          <w:color w:val="000000"/>
+          <w:rtl w:val="0"/>
+        </w:rPr>
+        <w:t xml:space="preserve">Research Domains describe what the project is about. Several may apply, and they are not ranked.</w:t>
+      </w:r>
+      <w:r>
+        <w:rPr>
+          <w:rtl w:val="0"/>
+        </w:rPr>
+      </w:r>
+    </w:p>
+    <w:p>
+      <w:pPr>
+        <w:rPr/>
+      </w:pPr>
+      <w:r>
+        <w:rPr>
+          <w:color w:val="000000"/>
+          <w:rtl w:val="0"/>
+        </w:rPr>
+        <w:t xml:space="preserve">Analytical Purposes describe what the project is trying to do analytically. One or two may apply.</w:t>
+      </w:r>
+      <w:r>
+        <w:rPr>
+          <w:rtl w:val="0"/>
+        </w:rPr>
+      </w:r>
+    </w:p>
+    <w:p>
+      <w:pPr>
+        <w:rPr/>
+      </w:pPr>
+      <w:r>
+        <w:rPr>
+          <w:color w:val="000000"/>
+          <w:rtl w:val="0"/>
+        </w:rPr>
+        <w:t xml:space="preserve">A Research Domain or Analytical Purpose should be treated as applying </w:t>
+      </w:r>
+      <w:r>
+        <w:rPr>
+          <w:b/>
+          <w:bCs/>
+          <w:color w:val="000000"/>
+          <w:rtl w:val="0"/>
+        </w:rPr>
+        <w:t xml:space="preserve">only when it is a substantive focus of the project’s research question or analytical aims</w:t>
+      </w:r>
+      <w:r>
+        <w:rPr>
+          <w:color w:val="000000"/>
+          <w:rtl w:val="0"/>
+        </w:rPr>
+        <w:t xml:space="preserve">—not merely because related terms, datasets, variables, methods or outcomes are mentioned or used.</w:t>
+      </w:r>
+      <w:r>
+        <w:rPr>
+          <w:rtl w:val="0"/>
+        </w:rPr>
+      </w:r>
+    </w:p>
+    <w:p>
+      <w:pPr>
+        <w:rPr/>
+      </w:pPr>
+      <w:r>
+        <w:rPr>
+          <w:color w:val="000000"/>
+          <w:rtl w:val="0"/>
+        </w:rPr>
+        <w:t xml:space="preserve">Cross-cutting tags show whether Demographic disparities / equity or COVID-19 &amp; Pandemic is a central feature of the research question. Either, both or neither may apply.</w:t>
+      </w:r>
+      <w:r>
+        <w:rPr>
+          <w:rtl w:val="0"/>
+        </w:rPr>
+      </w:r>
+    </w:p>
+    <w:p>
+      <w:pPr>
+        <w:rPr/>
+      </w:pPr>
+      <w:r>
+        <w:rPr>
+          <w:color w:val="000000"/>
+          <w:rtl w:val="0"/>
+        </w:rPr>
+        <w:t xml:space="preserve">Each proposed classification is shown with a definition. Please judge each one independently against the actual project and then assess whether its basis is visible in the public register entry.</w:t>
+      </w:r>
+      <w:r>
+        <w:rPr>
+          <w:rtl w:val="0"/>
+        </w:rPr>
+      </w:r>
+    </w:p>
+    <w:p>
+      <w:pPr>
+        <w:rPr/>
+      </w:pPr>
+      <w:r>
+        <w:rPr>
+          <w:color w:val="000000"/>
+          <w:rtl w:val="0"/>
+        </w:rPr>
         <w:t xml:space="preserve">Read-only classification overview: before the detailed questions, the survey shows the proposed Research Domains, the proposed Analytical Purposes and the proposed Applied / Not applied status for both cross-cutting tags. This overview is for context; every item is judged independently.</w:t>
       </w:r>
       <w:r>
@@ -1707,7 +1825,7 @@
           <w:color w:val="000000"/>
           <w:rtl w:val="0"/>
         </w:rPr>
-        <w:t xml:space="preserve">A cross-cutting tag for projects whose research question centres on comparing outcomes, experiences, risks, access, or trajectories across demographic or equality-relevant groups.</w:t>
+        <w:t xml:space="preserve">A cross-cutting tag for projects whose research question centres on comparing outcomes, experiences, risks, access, or trajectories across demographic or equality-relevant groups. Routine subgroup breakdowns do not qualify, and socioeconomic or deprivation-based inequality alone is insufficient unless comparison across demographic or equality-relevant groups is central.</w:t>
       </w:r>
       <w:r>
         <w:rPr>
@@ -2202,7 +2320,7 @@
           <w:color w:val="000000"/>
           <w:rtl w:val="0"/>
         </w:rPr>
-        <w:t xml:space="preserve">A cross-cutting tag for projects where COVID-19, the COVID-19 pandemic, pandemic conditions, infection surveillance, vaccination, lockdowns, social distancing, pandemic-related public support, or pandemic consequences are a central condition or lens for the research question.</w:t>
+        <w:t xml:space="preserve">A cross-cutting tag for projects where COVID-19, the COVID-19 pandemic, pandemic conditions, infection surveillance, vaccination, lockdowns, social distancing, pandemic-related public support, or pandemic consequences are a central condition or lens for the research question. Research does not qualify merely because its data cover the pandemic period or because COVID-19 is mentioned incidentally.</w:t>
       </w:r>
       <w:r>
         <w:rPr>
@@ -2829,6 +2947,44 @@
                 <w:szCs w:val="18"/>
                 <w:rtl w:val="0"/>
               </w:rPr>
+              <w:t xml:space="preserve">Select a missing Research Domain only if it represents </w:t>
+            </w:r>
+            <w:r>
+              <w:rPr>
+                <w:b/>
+                <w:bCs/>
+                <w:color w:val="000000"/>
+                <w:sz w:val="18"/>
+                <w:szCs w:val="18"/>
+                <w:rtl w:val="0"/>
+              </w:rPr>
+              <w:t xml:space="preserve">a substantive subject of the project</w:t>
+            </w:r>
+            <w:r>
+              <w:rPr>
+                <w:color w:val="000000"/>
+                <w:sz w:val="18"/>
+                <w:szCs w:val="18"/>
+                <w:rtl w:val="0"/>
+              </w:rPr>
+              <w:t xml:space="preserve">, not merely a dataset, variable, population characteristic or contextual factor used in the research.</w:t>
+            </w:r>
+          </w:p>
+          <w:p>
+            <w:pPr>
+              <w:rPr>
+                <w:color w:val="000000"/>
+                <w:sz w:val="18"/>
+                <w:szCs w:val="18"/>
+              </w:rPr>
+            </w:pPr>
+            <w:r>
+              <w:rPr>
+                <w:color w:val="000000"/>
+                <w:sz w:val="18"/>
+                <w:szCs w:val="18"/>
+                <w:rtl w:val="0"/>
+              </w:rPr>
               <w:t xml:space="preserve">Q6b. Which Research Domain label or labels are missing?  [Required]</w:t>
             </w:r>
           </w:p>
@@ -2847,7 +3003,7 @@
                 <w:szCs w:val="18"/>
                 <w:rtl w:val="0"/>
               </w:rPr>
-              <w:t xml:space="preserve">Response options: Labour Market &amp; Employment — Work, employment, earnings, job quality, workforce dynamics, skills demand and labour-market transitions. / Education &amp; Skills — Education, learning, training, skills formation and transitions through education systems and into work. / Health &amp; Social Care — Health, illness, mental health, wellbeing, mortality as a health outcome, healthcare services and social care. / Crime &amp; Justice — Crime, victimisation, public safety, policing, courts, sentencing, prisons, probation and justice outcomes. / Business &amp; Productivity — Firms, business activity, innovation, productivity, entrepreneurship, trade, investment and business performance. / Poverty, Wealth &amp; Living Standards — Material resources, poverty, wealth, debt, benefits, deprivation, cost of living and household income. / Housing &amp; Planning — Housing, homelessness, tenure, residential conditions and mobility, neighbourhood change and planning systems. / Migration &amp; Demographics — Population structure and change, migration, fertility, ageing and mortality as a demographic outcome. / Environment &amp; Agriculture — Environment, climate, energy, agriculture, land use, pollution, decarbonisation and environmental impacts. / Public Finance &amp; Taxation — Taxation, government revenue, public spending, fiscal transfers, tax reliefs and fiscal policy. / Data Infrastructure &amp; Methodology — Data or methodology as the primary research object, rather than tools used for another question.</w:t>
+              <w:t xml:space="preserve">Response options: Labour Market &amp; Employment — Work, employment, earnings, job quality, workforce dynamics, skills demand or labour-market transitions; not employment or earnings used only to measure the consequences of education, health or another substantive exposure unless labour-market outcomes are themselves a central focus. / Education &amp; Skills — Educational participation, attainment, qualifications, admissions, skills acquisition, training, apprenticeships or educational progression, including where later employment or earnings outcomes are used to study the effects of education or training; not education level used only as a subgroup, covariate or worker characteristic. / Health &amp; Social Care — Health, illness, mental health, wellbeing, clinical outcomes, healthcare access or use, mortality as a health outcome, and social care; not mortality studied only as a demographic or population outcome. / Crime &amp; Justice — Offending, victimisation, public safety, policing, courts, sentencing, prisons, probation, family justice, civil justice or justice-system outcomes; not general harm, risk, vulnerability or public-service use without crime, legal proceedings or justice-system involvement. / Business &amp; Productivity — Firms, business behaviour, innovation, productivity, entrepreneurship, trade, investment or firm performance; not firm-level data used only as a setting or source for another substantive question. / Poverty, Wealth &amp; Living Standards — Household income and resources, poverty, wealth, savings, debt, benefits, food insecurity, cost of living or material deprivation; not pay gaps, employment, deprivation indices, area-level disadvantage or demographic inequality unless household resources or living standards are central. / Housing &amp; Planning — Housing, homelessness, tenure, housing markets, residential conditions or mobility, neighbourhood change and planning; domestic energy or environmental exposure belongs here only where a housing, dwelling or residential mechanism is central, not merely because home, place or geography is mentioned. / Migration &amp; Demographics — Population structure or change, migration, fertility, ageing or mortality as a demographic outcome; not every study that includes demographic characteristics or subgroup comparisons. / Environment &amp; Agriculture — The natural environment, climate, energy, agriculture, land use, pollution, decarbonisation or environmental impacts; not “environment” used only to mean a social, economic, family or institutional context. / Public Finance &amp; Taxation — Taxation, tax compliance, tax credits, business rates, public revenue or expenditure, fiscal transfers, tax reliefs or fiscal policy; not private income, debt, wealth, investment or household finances without a public-finance mechanism. / Data Infrastructure &amp; Methodology — Research primarily about data, linkage, measurement, classifications, methods or statistical infrastructure; not merely a substantive project that uses linked data or advanced methods.</w:t>
             </w:r>
           </w:p>
           <w:p>
@@ -3165,6 +3321,44 @@
                 <w:rtl w:val="0"/>
               </w:rPr>
               <w:t xml:space="preserve">The framework assigns a maximum of two Analytical Purposes to each project. Select only the most important missing purpose or purposes, taking account of any proposed purposes that you judged to fit. The resulting classification should contain no more than two purposes in total.</w:t>
+            </w:r>
+          </w:p>
+          <w:p>
+            <w:pPr>
+              <w:rPr>
+                <w:color w:val="000000"/>
+                <w:sz w:val="18"/>
+                <w:szCs w:val="18"/>
+              </w:rPr>
+            </w:pPr>
+            <w:r>
+              <w:rPr>
+                <w:color w:val="000000"/>
+                <w:sz w:val="18"/>
+                <w:szCs w:val="18"/>
+                <w:rtl w:val="0"/>
+              </w:rPr>
+              <w:t xml:space="preserve">Select a missing Analytical Purpose only if it represents </w:t>
+            </w:r>
+            <w:r>
+              <w:rPr>
+                <w:b/>
+                <w:bCs/>
+                <w:color w:val="000000"/>
+                <w:sz w:val="18"/>
+                <w:szCs w:val="18"/>
+                <w:rtl w:val="0"/>
+              </w:rPr>
+              <w:t xml:space="preserve">a substantive analytical aim of the project</w:t>
+            </w:r>
+            <w:r>
+              <w:rPr>
+                <w:color w:val="000000"/>
+                <w:sz w:val="18"/>
+                <w:szCs w:val="18"/>
+                <w:rtl w:val="0"/>
+              </w:rPr>
+              <w:t xml:space="preserve">, not merely a method, analytical step or secondary feature of the work.</w:t>
             </w:r>
           </w:p>
           <w:p>

</xml_diff>